<commit_message>
docs: add section on visual and UI requirements
</commit_message>
<xml_diff>
--- a/Proposal.docx
+++ b/Proposal.docx
@@ -7,21 +7,21 @@
         <w:pStyle w:val="Heading1"/>
         <w:spacing w:after="80" w:line="240" w:lineRule="auto"/>
         <w:rPr>
-          <w:sz w:val="24"/>
-          <w:szCs w:val="24"/>
-        </w:rPr>
-      </w:pPr>
-      <w:r>
-        <w:rPr>
-          <w:sz w:val="24"/>
-          <w:szCs w:val="24"/>
+          <w:sz w:val="22"/>
+          <w:szCs w:val="22"/>
+        </w:rPr>
+      </w:pPr>
+      <w:r>
+        <w:rPr>
+          <w:sz w:val="22"/>
+          <w:szCs w:val="22"/>
         </w:rPr>
         <w:t xml:space="preserve">Bridgnorth Rowing Club </w:t>
       </w:r>
       <w:r>
         <w:rPr>
-          <w:sz w:val="24"/>
-          <w:szCs w:val="24"/>
+          <w:sz w:val="22"/>
+          <w:szCs w:val="22"/>
         </w:rPr>
         <w:t>Booking System Proposal</w:t>
       </w:r>
@@ -31,22 +31,6 @@
         <w:pStyle w:val="Subtitle"/>
         <w:spacing w:after="80" w:line="240" w:lineRule="auto"/>
         <w:rPr>
-          <w:sz w:val="22"/>
-          <w:szCs w:val="22"/>
-        </w:rPr>
-      </w:pPr>
-      <w:r>
-        <w:rPr>
-          <w:sz w:val="22"/>
-          <w:szCs w:val="22"/>
-        </w:rPr>
-        <w:t>Proposed Solution</w:t>
-      </w:r>
-    </w:p>
-    <w:p>
-      <w:pPr>
-        <w:spacing w:after="80" w:line="240" w:lineRule="auto"/>
-        <w:rPr>
           <w:sz w:val="21"/>
           <w:szCs w:val="21"/>
         </w:rPr>
@@ -56,50 +40,66 @@
           <w:sz w:val="21"/>
           <w:szCs w:val="21"/>
         </w:rPr>
+        <w:t>Proposed Solution</w:t>
+      </w:r>
+    </w:p>
+    <w:p>
+      <w:pPr>
+        <w:spacing w:after="80" w:line="240" w:lineRule="auto"/>
+        <w:rPr>
+          <w:sz w:val="20"/>
+          <w:szCs w:val="20"/>
+        </w:rPr>
+      </w:pPr>
+      <w:r>
+        <w:rPr>
+          <w:sz w:val="20"/>
+          <w:szCs w:val="20"/>
+        </w:rPr>
         <w:t xml:space="preserve">Online live booking system with </w:t>
       </w:r>
       <w:r>
+        <w:rPr>
+          <w:sz w:val="20"/>
+          <w:szCs w:val="20"/>
+        </w:rPr>
+        <w:t>multiple user access levels</w:t>
+      </w:r>
+      <w:r>
+        <w:rPr>
+          <w:sz w:val="20"/>
+          <w:szCs w:val="20"/>
+        </w:rPr>
+        <w:t xml:space="preserve">. Each member of the club who wishes to use either the club boats or ergs will be given login details with which to access the system. </w:t>
+      </w:r>
+      <w:r>
+        <w:rPr>
+          <w:sz w:val="20"/>
+          <w:szCs w:val="20"/>
+        </w:rPr>
+        <w:t xml:space="preserve">All users can see </w:t>
+      </w:r>
+      <w:r>
+        <w:rPr>
+          <w:sz w:val="20"/>
+          <w:szCs w:val="20"/>
+        </w:rPr>
+        <w:t xml:space="preserve">bookings made, clashing bookings will be prevented. Admins can see and edit all bookings and other information contained within the system. An information page will be included for further information about boats such as the average crew weight and accompanying blades. </w:t>
+      </w:r>
+    </w:p>
+    <w:p>
+      <w:pPr>
+        <w:pStyle w:val="Subtitle"/>
+        <w:spacing w:after="80" w:line="240" w:lineRule="auto"/>
         <w:rPr>
           <w:sz w:val="21"/>
           <w:szCs w:val="21"/>
         </w:rPr>
-        <w:t>multiple user access levels</w:t>
-      </w:r>
+      </w:pPr>
       <w:r>
         <w:rPr>
           <w:sz w:val="21"/>
           <w:szCs w:val="21"/>
-        </w:rPr>
-        <w:t xml:space="preserve">. Each member of the club who wishes to use either the club boats or ergs will be given login details with which to access the system. </w:t>
-      </w:r>
-      <w:r>
-        <w:rPr>
-          <w:sz w:val="21"/>
-          <w:szCs w:val="21"/>
-        </w:rPr>
-        <w:t xml:space="preserve">All users can see </w:t>
-      </w:r>
-      <w:r>
-        <w:rPr>
-          <w:sz w:val="21"/>
-          <w:szCs w:val="21"/>
-        </w:rPr>
-        <w:t xml:space="preserve">bookings made, clashing bookings will be prevented. Admins can see and edit all bookings and other information contained within the system. An information page will be included for further information about boats such as the average crew weight and accompanying blades. </w:t>
-      </w:r>
-    </w:p>
-    <w:p>
-      <w:pPr>
-        <w:pStyle w:val="Subtitle"/>
-        <w:spacing w:after="80" w:line="240" w:lineRule="auto"/>
-        <w:rPr>
-          <w:sz w:val="22"/>
-          <w:szCs w:val="22"/>
-        </w:rPr>
-      </w:pPr>
-      <w:r>
-        <w:rPr>
-          <w:sz w:val="22"/>
-          <w:szCs w:val="22"/>
         </w:rPr>
         <w:t>User hierarchy and privileges:</w:t>
       </w:r>
@@ -113,37 +113,37 @@
         </w:numPr>
         <w:spacing w:after="80"/>
         <w:rPr>
-          <w:sz w:val="21"/>
-          <w:szCs w:val="21"/>
+          <w:sz w:val="20"/>
+          <w:szCs w:val="20"/>
         </w:rPr>
       </w:pPr>
       <w:r>
         <w:rPr>
           <w:b/>
           <w:bCs/>
-          <w:sz w:val="21"/>
-          <w:szCs w:val="21"/>
+          <w:sz w:val="20"/>
+          <w:szCs w:val="20"/>
         </w:rPr>
         <w:t>Admin</w:t>
       </w:r>
       <w:r>
         <w:rPr>
-          <w:sz w:val="21"/>
-          <w:szCs w:val="21"/>
+          <w:sz w:val="20"/>
+          <w:szCs w:val="20"/>
         </w:rPr>
         <w:t xml:space="preserve"> – can add/edit/remove boats, blades, </w:t>
       </w:r>
       <w:r>
         <w:rPr>
-          <w:sz w:val="21"/>
-          <w:szCs w:val="21"/>
+          <w:sz w:val="20"/>
+          <w:szCs w:val="20"/>
         </w:rPr>
         <w:t xml:space="preserve">bookings, </w:t>
       </w:r>
       <w:r>
         <w:rPr>
-          <w:sz w:val="21"/>
-          <w:szCs w:val="21"/>
+          <w:sz w:val="20"/>
+          <w:szCs w:val="20"/>
         </w:rPr>
         <w:t>equipment and users from the system</w:t>
       </w:r>
@@ -157,54 +157,54 @@
         </w:numPr>
         <w:spacing w:after="80"/>
         <w:rPr>
+          <w:sz w:val="20"/>
+          <w:szCs w:val="20"/>
+        </w:rPr>
+      </w:pPr>
+      <w:r>
+        <w:rPr>
+          <w:b/>
+          <w:bCs/>
+          <w:sz w:val="20"/>
+          <w:szCs w:val="20"/>
+        </w:rPr>
+        <w:t xml:space="preserve">User </w:t>
+      </w:r>
+      <w:r>
+        <w:rPr>
+          <w:sz w:val="20"/>
+          <w:szCs w:val="20"/>
+        </w:rPr>
+        <w:t>– can make bookings</w:t>
+      </w:r>
+      <w:r>
+        <w:rPr>
+          <w:sz w:val="20"/>
+          <w:szCs w:val="20"/>
+        </w:rPr>
+        <w:t xml:space="preserve"> and </w:t>
+      </w:r>
+      <w:r>
+        <w:rPr>
+          <w:sz w:val="20"/>
+          <w:szCs w:val="20"/>
+        </w:rPr>
+        <w:t>can edit/delete bookings they own</w:t>
+      </w:r>
+    </w:p>
+    <w:p>
+      <w:pPr>
+        <w:pStyle w:val="Subtitle"/>
+        <w:spacing w:after="80" w:line="240" w:lineRule="auto"/>
+        <w:rPr>
           <w:sz w:val="21"/>
           <w:szCs w:val="21"/>
         </w:rPr>
       </w:pPr>
       <w:r>
         <w:rPr>
-          <w:b/>
-          <w:bCs/>
           <w:sz w:val="21"/>
           <w:szCs w:val="21"/>
-        </w:rPr>
-        <w:t xml:space="preserve">User </w:t>
-      </w:r>
-      <w:r>
-        <w:rPr>
-          <w:sz w:val="21"/>
-          <w:szCs w:val="21"/>
-        </w:rPr>
-        <w:t>– can make bookings</w:t>
-      </w:r>
-      <w:r>
-        <w:rPr>
-          <w:sz w:val="21"/>
-          <w:szCs w:val="21"/>
-        </w:rPr>
-        <w:t xml:space="preserve"> and </w:t>
-      </w:r>
-      <w:r>
-        <w:rPr>
-          <w:sz w:val="21"/>
-          <w:szCs w:val="21"/>
-        </w:rPr>
-        <w:t>can edit/delete bookings they own</w:t>
-      </w:r>
-    </w:p>
-    <w:p>
-      <w:pPr>
-        <w:pStyle w:val="Subtitle"/>
-        <w:spacing w:after="80" w:line="240" w:lineRule="auto"/>
-        <w:rPr>
-          <w:sz w:val="22"/>
-          <w:szCs w:val="22"/>
-        </w:rPr>
-      </w:pPr>
-      <w:r>
-        <w:rPr>
-          <w:sz w:val="22"/>
-          <w:szCs w:val="22"/>
         </w:rPr>
         <w:t>Suggested pages:</w:t>
       </w:r>
@@ -218,14 +218,14 @@
         </w:numPr>
         <w:ind w:hanging="357"/>
         <w:rPr>
-          <w:sz w:val="21"/>
-          <w:szCs w:val="21"/>
-        </w:rPr>
-      </w:pPr>
-      <w:r>
-        <w:rPr>
-          <w:sz w:val="21"/>
-          <w:szCs w:val="21"/>
+          <w:sz w:val="20"/>
+          <w:szCs w:val="20"/>
+        </w:rPr>
+      </w:pPr>
+      <w:r>
+        <w:rPr>
+          <w:sz w:val="20"/>
+          <w:szCs w:val="20"/>
         </w:rPr>
         <w:t>Login</w:t>
       </w:r>
@@ -239,21 +239,21 @@
         </w:numPr>
         <w:ind w:hanging="357"/>
         <w:rPr>
-          <w:sz w:val="21"/>
-          <w:szCs w:val="21"/>
-        </w:rPr>
-      </w:pPr>
-      <w:r>
-        <w:rPr>
-          <w:sz w:val="21"/>
-          <w:szCs w:val="21"/>
+          <w:sz w:val="20"/>
+          <w:szCs w:val="20"/>
+        </w:rPr>
+      </w:pPr>
+      <w:r>
+        <w:rPr>
+          <w:sz w:val="20"/>
+          <w:szCs w:val="20"/>
         </w:rPr>
         <w:t xml:space="preserve">Select booking type </w:t>
       </w:r>
       <w:r>
         <w:rPr>
-          <w:sz w:val="21"/>
-          <w:szCs w:val="21"/>
+          <w:sz w:val="20"/>
+          <w:szCs w:val="20"/>
         </w:rPr>
         <w:t>(boat or erg)</w:t>
       </w:r>
@@ -267,14 +267,14 @@
         </w:numPr>
         <w:ind w:hanging="357"/>
         <w:rPr>
-          <w:sz w:val="21"/>
-          <w:szCs w:val="21"/>
-        </w:rPr>
-      </w:pPr>
-      <w:r>
-        <w:rPr>
-          <w:sz w:val="21"/>
-          <w:szCs w:val="21"/>
+          <w:sz w:val="20"/>
+          <w:szCs w:val="20"/>
+        </w:rPr>
+      </w:pPr>
+      <w:r>
+        <w:rPr>
+          <w:sz w:val="20"/>
+          <w:szCs w:val="20"/>
         </w:rPr>
         <w:t>Book a boat</w:t>
       </w:r>
@@ -288,14 +288,14 @@
         </w:numPr>
         <w:ind w:hanging="357"/>
         <w:rPr>
-          <w:sz w:val="21"/>
-          <w:szCs w:val="21"/>
-        </w:rPr>
-      </w:pPr>
-      <w:r>
-        <w:rPr>
-          <w:sz w:val="21"/>
-          <w:szCs w:val="21"/>
+          <w:sz w:val="20"/>
+          <w:szCs w:val="20"/>
+        </w:rPr>
+      </w:pPr>
+      <w:r>
+        <w:rPr>
+          <w:sz w:val="20"/>
+          <w:szCs w:val="20"/>
         </w:rPr>
         <w:t>Book an erg</w:t>
       </w:r>
@@ -309,14 +309,14 @@
         </w:numPr>
         <w:ind w:hanging="357"/>
         <w:rPr>
-          <w:sz w:val="21"/>
-          <w:szCs w:val="21"/>
-        </w:rPr>
-      </w:pPr>
-      <w:r>
-        <w:rPr>
-          <w:sz w:val="21"/>
-          <w:szCs w:val="21"/>
+          <w:sz w:val="20"/>
+          <w:szCs w:val="20"/>
+        </w:rPr>
+      </w:pPr>
+      <w:r>
+        <w:rPr>
+          <w:sz w:val="20"/>
+          <w:szCs w:val="20"/>
         </w:rPr>
         <w:t>Manage my bookings</w:t>
       </w:r>
@@ -330,14 +330,14 @@
         </w:numPr>
         <w:ind w:hanging="357"/>
         <w:rPr>
-          <w:sz w:val="21"/>
-          <w:szCs w:val="21"/>
-        </w:rPr>
-      </w:pPr>
-      <w:r>
-        <w:rPr>
-          <w:sz w:val="21"/>
-          <w:szCs w:val="21"/>
+          <w:sz w:val="20"/>
+          <w:szCs w:val="20"/>
+        </w:rPr>
+      </w:pPr>
+      <w:r>
+        <w:rPr>
+          <w:sz w:val="20"/>
+          <w:szCs w:val="20"/>
         </w:rPr>
         <w:t>View schedule</w:t>
       </w:r>
@@ -351,14 +351,14 @@
         </w:numPr>
         <w:ind w:hanging="357"/>
         <w:rPr>
-          <w:sz w:val="21"/>
-          <w:szCs w:val="21"/>
-        </w:rPr>
-      </w:pPr>
-      <w:r>
-        <w:rPr>
-          <w:sz w:val="21"/>
-          <w:szCs w:val="21"/>
+          <w:sz w:val="20"/>
+          <w:szCs w:val="20"/>
+        </w:rPr>
+      </w:pPr>
+      <w:r>
+        <w:rPr>
+          <w:sz w:val="20"/>
+          <w:szCs w:val="20"/>
         </w:rPr>
         <w:t>Boat list</w:t>
       </w:r>
@@ -372,14 +372,14 @@
         </w:numPr>
         <w:ind w:hanging="357"/>
         <w:rPr>
-          <w:sz w:val="21"/>
-          <w:szCs w:val="21"/>
-        </w:rPr>
-      </w:pPr>
-      <w:r>
-        <w:rPr>
-          <w:sz w:val="21"/>
-          <w:szCs w:val="21"/>
+          <w:sz w:val="20"/>
+          <w:szCs w:val="20"/>
+        </w:rPr>
+      </w:pPr>
+      <w:r>
+        <w:rPr>
+          <w:sz w:val="20"/>
+          <w:szCs w:val="20"/>
         </w:rPr>
         <w:t>Boat information</w:t>
       </w:r>
@@ -393,14 +393,14 @@
         </w:numPr>
         <w:ind w:hanging="357"/>
         <w:rPr>
-          <w:sz w:val="21"/>
-          <w:szCs w:val="21"/>
-        </w:rPr>
-      </w:pPr>
-      <w:r>
-        <w:rPr>
-          <w:sz w:val="21"/>
-          <w:szCs w:val="21"/>
+          <w:sz w:val="20"/>
+          <w:szCs w:val="20"/>
+        </w:rPr>
+      </w:pPr>
+      <w:r>
+        <w:rPr>
+          <w:sz w:val="20"/>
+          <w:szCs w:val="20"/>
         </w:rPr>
         <w:t>Manage all bookings (admin only)</w:t>
       </w:r>
@@ -414,14 +414,14 @@
         </w:numPr>
         <w:ind w:hanging="357"/>
         <w:rPr>
-          <w:sz w:val="21"/>
-          <w:szCs w:val="21"/>
-        </w:rPr>
-      </w:pPr>
-      <w:r>
-        <w:rPr>
-          <w:sz w:val="21"/>
-          <w:szCs w:val="21"/>
+          <w:sz w:val="20"/>
+          <w:szCs w:val="20"/>
+        </w:rPr>
+      </w:pPr>
+      <w:r>
+        <w:rPr>
+          <w:sz w:val="20"/>
+          <w:szCs w:val="20"/>
         </w:rPr>
         <w:t>Manage equipment (admin only)</w:t>
       </w:r>
@@ -435,14 +435,14 @@
         </w:numPr>
         <w:ind w:hanging="357"/>
         <w:rPr>
-          <w:sz w:val="21"/>
-          <w:szCs w:val="21"/>
-        </w:rPr>
-      </w:pPr>
-      <w:r>
-        <w:rPr>
-          <w:sz w:val="21"/>
-          <w:szCs w:val="21"/>
+          <w:sz w:val="20"/>
+          <w:szCs w:val="20"/>
+        </w:rPr>
+      </w:pPr>
+      <w:r>
+        <w:rPr>
+          <w:sz w:val="20"/>
+          <w:szCs w:val="20"/>
         </w:rPr>
         <w:t>Boats</w:t>
       </w:r>
@@ -456,14 +456,14 @@
         </w:numPr>
         <w:ind w:hanging="357"/>
         <w:rPr>
-          <w:sz w:val="21"/>
-          <w:szCs w:val="21"/>
-        </w:rPr>
-      </w:pPr>
-      <w:r>
-        <w:rPr>
-          <w:sz w:val="21"/>
-          <w:szCs w:val="21"/>
+          <w:sz w:val="20"/>
+          <w:szCs w:val="20"/>
+        </w:rPr>
+      </w:pPr>
+      <w:r>
+        <w:rPr>
+          <w:sz w:val="20"/>
+          <w:szCs w:val="20"/>
         </w:rPr>
         <w:t>Blades</w:t>
       </w:r>
@@ -477,14 +477,14 @@
         </w:numPr>
         <w:ind w:hanging="357"/>
         <w:rPr>
-          <w:sz w:val="21"/>
-          <w:szCs w:val="21"/>
-        </w:rPr>
-      </w:pPr>
-      <w:r>
-        <w:rPr>
-          <w:sz w:val="21"/>
-          <w:szCs w:val="21"/>
+          <w:sz w:val="20"/>
+          <w:szCs w:val="20"/>
+        </w:rPr>
+      </w:pPr>
+      <w:r>
+        <w:rPr>
+          <w:sz w:val="20"/>
+          <w:szCs w:val="20"/>
         </w:rPr>
         <w:t>Other equipment</w:t>
       </w:r>
@@ -495,16 +495,103 @@
         <w:spacing w:after="80"/>
         <w:ind w:left="1080"/>
         <w:rPr>
+          <w:sz w:val="20"/>
+          <w:szCs w:val="20"/>
+        </w:rPr>
+      </w:pPr>
+    </w:p>
+    <w:p>
+      <w:pPr>
+        <w:pStyle w:val="NoSpacing"/>
+        <w:spacing w:after="80"/>
+        <w:rPr>
+          <w:sz w:val="20"/>
+          <w:szCs w:val="20"/>
+        </w:rPr>
+      </w:pPr>
+      <w:r>
+        <w:rPr>
+          <w:sz w:val="20"/>
+          <w:szCs w:val="20"/>
+        </w:rPr>
+        <w:t>What other pages are desired?</w:t>
+      </w:r>
+    </w:p>
+    <w:p>
+      <w:pPr>
+        <w:pStyle w:val="NoSpacing"/>
+        <w:spacing w:after="80"/>
+        <w:rPr>
+          <w:sz w:val="20"/>
+          <w:szCs w:val="20"/>
+        </w:rPr>
+      </w:pPr>
+    </w:p>
+    <w:p>
+      <w:pPr>
+        <w:pStyle w:val="NoSpacing"/>
+        <w:spacing w:after="80"/>
+        <w:rPr>
+          <w:sz w:val="20"/>
+          <w:szCs w:val="20"/>
+        </w:rPr>
+      </w:pPr>
+      <w:r>
+        <w:rPr>
+          <w:rStyle w:val="SubtitleChar"/>
           <w:sz w:val="21"/>
           <w:szCs w:val="21"/>
         </w:rPr>
-      </w:pPr>
+        <w:t>Login details:</w:t>
+      </w:r>
+      <w:r>
+        <w:rPr>
+          <w:sz w:val="20"/>
+          <w:szCs w:val="20"/>
+        </w:rPr>
+        <w:br/>
+        <w:t xml:space="preserve">Login details for regular users will comprise of a unique username generated from their name and other information. In addition to this mandatory passwords is an option for a more secure system </w:t>
+      </w:r>
+      <w:r>
+        <w:rPr>
+          <w:sz w:val="20"/>
+          <w:szCs w:val="20"/>
+        </w:rPr>
+        <w:t>but this will require all users to supply both a username and password each time they wish to access the system.</w:t>
+      </w:r>
     </w:p>
     <w:p>
       <w:pPr>
         <w:pStyle w:val="NoSpacing"/>
         <w:spacing w:after="80"/>
         <w:rPr>
+          <w:sz w:val="20"/>
+          <w:szCs w:val="20"/>
+        </w:rPr>
+      </w:pPr>
+      <w:r>
+        <w:rPr>
+          <w:sz w:val="20"/>
+          <w:szCs w:val="20"/>
+        </w:rPr>
+        <w:t xml:space="preserve">Admin users can be required to have both a username and password without the same requirement for other users. </w:t>
+      </w:r>
+    </w:p>
+    <w:p>
+      <w:pPr>
+        <w:pStyle w:val="NoSpacing"/>
+        <w:spacing w:after="80"/>
+        <w:rPr>
+          <w:sz w:val="20"/>
+          <w:szCs w:val="20"/>
+        </w:rPr>
+      </w:pPr>
+    </w:p>
+    <w:p>
+      <w:pPr>
+        <w:pStyle w:val="Subtitle"/>
+        <w:spacing w:after="80" w:line="240" w:lineRule="auto"/>
+        <w:rPr>
           <w:sz w:val="21"/>
           <w:szCs w:val="21"/>
         </w:rPr>
@@ -514,124 +601,37 @@
           <w:sz w:val="21"/>
           <w:szCs w:val="21"/>
         </w:rPr>
-        <w:t>What other pages are desired?</w:t>
-      </w:r>
-    </w:p>
-    <w:p>
-      <w:pPr>
-        <w:pStyle w:val="NoSpacing"/>
-        <w:spacing w:after="80"/>
-        <w:rPr>
-          <w:sz w:val="21"/>
-          <w:szCs w:val="21"/>
-        </w:rPr>
-      </w:pPr>
-    </w:p>
-    <w:p>
-      <w:pPr>
-        <w:pStyle w:val="NoSpacing"/>
-        <w:spacing w:after="80"/>
-        <w:rPr>
-          <w:sz w:val="21"/>
-          <w:szCs w:val="21"/>
-        </w:rPr>
-      </w:pPr>
-      <w:r>
-        <w:rPr>
-          <w:rStyle w:val="SubtitleChar"/>
-          <w:sz w:val="22"/>
-          <w:szCs w:val="22"/>
-        </w:rPr>
-        <w:t>Login details:</w:t>
-      </w:r>
-      <w:r>
-        <w:rPr>
-          <w:sz w:val="21"/>
-          <w:szCs w:val="21"/>
-        </w:rPr>
-        <w:br/>
-        <w:t xml:space="preserve">Login details for regular users will comprise of a unique username generated from their name and other information. In addition to this mandatory passwords is an option for a more secure system </w:t>
-      </w:r>
-      <w:r>
-        <w:rPr>
-          <w:sz w:val="21"/>
-          <w:szCs w:val="21"/>
-        </w:rPr>
-        <w:t>but this will require all users to supply both a username and password each time they wish to access the system.</w:t>
-      </w:r>
-    </w:p>
-    <w:p>
-      <w:pPr>
-        <w:pStyle w:val="NoSpacing"/>
-        <w:spacing w:after="80"/>
-        <w:rPr>
-          <w:sz w:val="21"/>
-          <w:szCs w:val="21"/>
-        </w:rPr>
-      </w:pPr>
-      <w:r>
-        <w:rPr>
-          <w:sz w:val="21"/>
-          <w:szCs w:val="21"/>
-        </w:rPr>
-        <w:t xml:space="preserve">Admin users can be required to have both a username and password without the same requirement for other users. </w:t>
-      </w:r>
-    </w:p>
-    <w:p>
-      <w:pPr>
-        <w:pStyle w:val="NoSpacing"/>
-        <w:spacing w:after="80"/>
-        <w:rPr>
-          <w:sz w:val="21"/>
-          <w:szCs w:val="21"/>
-        </w:rPr>
-      </w:pPr>
-    </w:p>
-    <w:p>
-      <w:pPr>
-        <w:pStyle w:val="Subtitle"/>
+        <w:t>System information:</w:t>
+      </w:r>
+    </w:p>
+    <w:p>
+      <w:pPr>
         <w:spacing w:after="80" w:line="240" w:lineRule="auto"/>
         <w:rPr>
-          <w:sz w:val="22"/>
-          <w:szCs w:val="22"/>
-        </w:rPr>
-      </w:pPr>
-      <w:r>
-        <w:rPr>
-          <w:sz w:val="22"/>
-          <w:szCs w:val="22"/>
-        </w:rPr>
-        <w:t>System information:</w:t>
+          <w:sz w:val="20"/>
+          <w:szCs w:val="20"/>
+        </w:rPr>
+      </w:pPr>
+      <w:r>
+        <w:rPr>
+          <w:sz w:val="20"/>
+          <w:szCs w:val="20"/>
+        </w:rPr>
+        <w:t>The following is the information the system may store:</w:t>
       </w:r>
     </w:p>
     <w:p>
       <w:pPr>
         <w:spacing w:after="80" w:line="240" w:lineRule="auto"/>
         <w:rPr>
-          <w:sz w:val="21"/>
-          <w:szCs w:val="21"/>
-        </w:rPr>
-      </w:pPr>
-      <w:r>
-        <w:rPr>
-          <w:sz w:val="21"/>
-          <w:szCs w:val="21"/>
-        </w:rPr>
-        <w:t>The following is the information the system may store:</w:t>
-      </w:r>
-    </w:p>
-    <w:p>
-      <w:pPr>
-        <w:spacing w:after="80" w:line="240" w:lineRule="auto"/>
-        <w:rPr>
-          <w:sz w:val="21"/>
-          <w:szCs w:val="21"/>
-        </w:rPr>
-      </w:pPr>
-      <w:r>
-        <w:rPr>
-          <w:sz w:val="21"/>
-          <w:szCs w:val="21"/>
+          <w:sz w:val="20"/>
+          <w:szCs w:val="20"/>
+        </w:rPr>
+      </w:pPr>
+      <w:r>
+        <w:rPr>
+          <w:sz w:val="20"/>
+          <w:szCs w:val="20"/>
         </w:rPr>
         <w:t>Boats:</w:t>
       </w:r>
@@ -646,14 +646,14 @@
         <w:spacing w:after="0" w:line="240" w:lineRule="auto"/>
         <w:ind w:left="714" w:hanging="357"/>
         <w:rPr>
-          <w:sz w:val="21"/>
-          <w:szCs w:val="21"/>
-        </w:rPr>
-      </w:pPr>
-      <w:r>
-        <w:rPr>
-          <w:sz w:val="21"/>
-          <w:szCs w:val="21"/>
+          <w:sz w:val="20"/>
+          <w:szCs w:val="20"/>
+        </w:rPr>
+      </w:pPr>
+      <w:r>
+        <w:rPr>
+          <w:sz w:val="20"/>
+          <w:szCs w:val="20"/>
         </w:rPr>
         <w:t>Name</w:t>
       </w:r>
@@ -668,14 +668,14 @@
         <w:spacing w:after="0" w:line="240" w:lineRule="auto"/>
         <w:ind w:left="714" w:hanging="357"/>
         <w:rPr>
-          <w:sz w:val="21"/>
-          <w:szCs w:val="21"/>
-        </w:rPr>
-      </w:pPr>
-      <w:r>
-        <w:rPr>
-          <w:sz w:val="21"/>
-          <w:szCs w:val="21"/>
+          <w:sz w:val="20"/>
+          <w:szCs w:val="20"/>
+        </w:rPr>
+      </w:pPr>
+      <w:r>
+        <w:rPr>
+          <w:sz w:val="20"/>
+          <w:szCs w:val="20"/>
         </w:rPr>
         <w:t>Number of seats</w:t>
       </w:r>
@@ -690,14 +690,14 @@
         <w:spacing w:after="0" w:line="240" w:lineRule="auto"/>
         <w:ind w:left="714" w:hanging="357"/>
         <w:rPr>
-          <w:sz w:val="21"/>
-          <w:szCs w:val="21"/>
-        </w:rPr>
-      </w:pPr>
-      <w:r>
-        <w:rPr>
-          <w:sz w:val="21"/>
-          <w:szCs w:val="21"/>
+          <w:sz w:val="20"/>
+          <w:szCs w:val="20"/>
+        </w:rPr>
+      </w:pPr>
+      <w:r>
+        <w:rPr>
+          <w:sz w:val="20"/>
+          <w:szCs w:val="20"/>
         </w:rPr>
         <w:t>Average crew weight</w:t>
       </w:r>
@@ -712,14 +712,14 @@
         <w:spacing w:after="0" w:line="240" w:lineRule="auto"/>
         <w:ind w:left="714" w:hanging="357"/>
         <w:rPr>
-          <w:sz w:val="21"/>
-          <w:szCs w:val="21"/>
-        </w:rPr>
-      </w:pPr>
-      <w:r>
-        <w:rPr>
-          <w:sz w:val="21"/>
-          <w:szCs w:val="21"/>
+          <w:sz w:val="20"/>
+          <w:szCs w:val="20"/>
+        </w:rPr>
+      </w:pPr>
+      <w:r>
+        <w:rPr>
+          <w:sz w:val="20"/>
+          <w:szCs w:val="20"/>
         </w:rPr>
         <w:t>Last rigged as</w:t>
       </w:r>
@@ -734,14 +734,14 @@
         <w:spacing w:after="0" w:line="240" w:lineRule="auto"/>
         <w:ind w:left="714" w:hanging="357"/>
         <w:rPr>
-          <w:sz w:val="21"/>
-          <w:szCs w:val="21"/>
-        </w:rPr>
-      </w:pPr>
-      <w:r>
-        <w:rPr>
-          <w:sz w:val="21"/>
-          <w:szCs w:val="21"/>
+          <w:sz w:val="20"/>
+          <w:szCs w:val="20"/>
+        </w:rPr>
+      </w:pPr>
+      <w:r>
+        <w:rPr>
+          <w:sz w:val="20"/>
+          <w:szCs w:val="20"/>
         </w:rPr>
         <w:t xml:space="preserve">Steering </w:t>
       </w:r>
@@ -756,14 +756,14 @@
         <w:spacing w:after="0" w:line="240" w:lineRule="auto"/>
         <w:ind w:left="714" w:hanging="357"/>
         <w:rPr>
-          <w:sz w:val="21"/>
-          <w:szCs w:val="21"/>
-        </w:rPr>
-      </w:pPr>
-      <w:r>
-        <w:rPr>
-          <w:sz w:val="21"/>
-          <w:szCs w:val="21"/>
+          <w:sz w:val="20"/>
+          <w:szCs w:val="20"/>
+        </w:rPr>
+      </w:pPr>
+      <w:r>
+        <w:rPr>
+          <w:sz w:val="20"/>
+          <w:szCs w:val="20"/>
         </w:rPr>
         <w:t xml:space="preserve">Additional info </w:t>
       </w:r>
@@ -778,14 +778,14 @@
         <w:spacing w:after="0" w:line="240" w:lineRule="auto"/>
         <w:ind w:left="714" w:hanging="357"/>
         <w:rPr>
-          <w:sz w:val="21"/>
-          <w:szCs w:val="21"/>
-        </w:rPr>
-      </w:pPr>
-      <w:r>
-        <w:rPr>
-          <w:sz w:val="21"/>
-          <w:szCs w:val="21"/>
+          <w:sz w:val="20"/>
+          <w:szCs w:val="20"/>
+        </w:rPr>
+      </w:pPr>
+      <w:r>
+        <w:rPr>
+          <w:sz w:val="20"/>
+          <w:szCs w:val="20"/>
         </w:rPr>
         <w:t>Number of times this boat has been booked</w:t>
       </w:r>
@@ -800,14 +800,14 @@
         <w:spacing w:after="0" w:line="240" w:lineRule="auto"/>
         <w:ind w:left="714" w:hanging="357"/>
         <w:rPr>
-          <w:sz w:val="21"/>
-          <w:szCs w:val="21"/>
-        </w:rPr>
-      </w:pPr>
-      <w:r>
-        <w:rPr>
-          <w:sz w:val="21"/>
-          <w:szCs w:val="21"/>
+          <w:sz w:val="20"/>
+          <w:szCs w:val="20"/>
+        </w:rPr>
+      </w:pPr>
+      <w:r>
+        <w:rPr>
+          <w:sz w:val="20"/>
+          <w:szCs w:val="20"/>
         </w:rPr>
         <w:t>Number of times a booking of this boat has been cancelled (used with the above data to calculate the number of sessions this boat has had)</w:t>
       </w:r>
@@ -822,14 +822,14 @@
         <w:spacing w:after="0" w:line="240" w:lineRule="auto"/>
         <w:ind w:left="714" w:hanging="357"/>
         <w:rPr>
-          <w:sz w:val="21"/>
-          <w:szCs w:val="21"/>
-        </w:rPr>
-      </w:pPr>
-      <w:r>
-        <w:rPr>
-          <w:sz w:val="21"/>
-          <w:szCs w:val="21"/>
+          <w:sz w:val="20"/>
+          <w:szCs w:val="20"/>
+        </w:rPr>
+      </w:pPr>
+      <w:r>
+        <w:rPr>
+          <w:sz w:val="20"/>
+          <w:szCs w:val="20"/>
         </w:rPr>
         <w:t xml:space="preserve">Boat weight </w:t>
       </w:r>
@@ -844,14 +844,14 @@
         <w:spacing w:after="0" w:line="240" w:lineRule="auto"/>
         <w:ind w:left="714" w:hanging="357"/>
         <w:rPr>
-          <w:sz w:val="21"/>
-          <w:szCs w:val="21"/>
-        </w:rPr>
-      </w:pPr>
-      <w:r>
-        <w:rPr>
-          <w:sz w:val="21"/>
-          <w:szCs w:val="21"/>
+          <w:sz w:val="20"/>
+          <w:szCs w:val="20"/>
+        </w:rPr>
+      </w:pPr>
+      <w:r>
+        <w:rPr>
+          <w:sz w:val="20"/>
+          <w:szCs w:val="20"/>
         </w:rPr>
         <w:t xml:space="preserve">Which blades are suitable for this boat </w:t>
       </w:r>
@@ -860,8 +860,8 @@
       <w:pPr>
         <w:spacing w:after="0" w:line="240" w:lineRule="auto"/>
         <w:rPr>
-          <w:sz w:val="21"/>
-          <w:szCs w:val="21"/>
+          <w:sz w:val="20"/>
+          <w:szCs w:val="20"/>
         </w:rPr>
       </w:pPr>
     </w:p>
@@ -869,8 +869,8 @@
       <w:pPr>
         <w:spacing w:after="0" w:line="240" w:lineRule="auto"/>
         <w:rPr>
-          <w:sz w:val="21"/>
-          <w:szCs w:val="21"/>
+          <w:sz w:val="20"/>
+          <w:szCs w:val="20"/>
         </w:rPr>
       </w:pPr>
     </w:p>
@@ -878,8 +878,8 @@
       <w:pPr>
         <w:spacing w:after="0" w:line="240" w:lineRule="auto"/>
         <w:rPr>
-          <w:sz w:val="21"/>
-          <w:szCs w:val="21"/>
+          <w:sz w:val="20"/>
+          <w:szCs w:val="20"/>
         </w:rPr>
       </w:pPr>
     </w:p>
@@ -887,8 +887,8 @@
       <w:pPr>
         <w:spacing w:after="0" w:line="240" w:lineRule="auto"/>
         <w:rPr>
-          <w:sz w:val="21"/>
-          <w:szCs w:val="21"/>
+          <w:sz w:val="20"/>
+          <w:szCs w:val="20"/>
         </w:rPr>
       </w:pPr>
     </w:p>
@@ -896,8 +896,8 @@
       <w:pPr>
         <w:spacing w:after="0" w:line="240" w:lineRule="auto"/>
         <w:rPr>
-          <w:sz w:val="21"/>
-          <w:szCs w:val="21"/>
+          <w:sz w:val="20"/>
+          <w:szCs w:val="20"/>
         </w:rPr>
       </w:pPr>
     </w:p>
@@ -905,16 +905,15 @@
       <w:pPr>
         <w:spacing w:after="80" w:line="240" w:lineRule="auto"/>
         <w:rPr>
-          <w:sz w:val="21"/>
-          <w:szCs w:val="21"/>
-        </w:rPr>
-      </w:pPr>
-      <w:r>
-        <w:rPr>
-          <w:sz w:val="21"/>
-          <w:szCs w:val="21"/>
-        </w:rPr>
-        <w:lastRenderedPageBreak/>
+          <w:sz w:val="20"/>
+          <w:szCs w:val="20"/>
+        </w:rPr>
+      </w:pPr>
+      <w:r>
+        <w:rPr>
+          <w:sz w:val="20"/>
+          <w:szCs w:val="20"/>
+        </w:rPr>
         <w:t>Blades:</w:t>
       </w:r>
     </w:p>
@@ -928,14 +927,14 @@
         <w:spacing w:after="0" w:line="240" w:lineRule="auto"/>
         <w:ind w:left="765" w:hanging="357"/>
         <w:rPr>
-          <w:sz w:val="21"/>
-          <w:szCs w:val="21"/>
-        </w:rPr>
-      </w:pPr>
-      <w:r>
-        <w:rPr>
-          <w:sz w:val="21"/>
-          <w:szCs w:val="21"/>
+          <w:sz w:val="20"/>
+          <w:szCs w:val="20"/>
+        </w:rPr>
+      </w:pPr>
+      <w:r>
+        <w:rPr>
+          <w:sz w:val="20"/>
+          <w:szCs w:val="20"/>
         </w:rPr>
         <w:t>Name</w:t>
       </w:r>
@@ -950,15 +949,16 @@
         <w:spacing w:after="0" w:line="240" w:lineRule="auto"/>
         <w:ind w:left="765" w:hanging="357"/>
         <w:rPr>
-          <w:sz w:val="21"/>
-          <w:szCs w:val="21"/>
-        </w:rPr>
-      </w:pPr>
-      <w:r>
-        <w:rPr>
-          <w:sz w:val="21"/>
-          <w:szCs w:val="21"/>
-        </w:rPr>
+          <w:sz w:val="20"/>
+          <w:szCs w:val="20"/>
+        </w:rPr>
+      </w:pPr>
+      <w:r>
+        <w:rPr>
+          <w:sz w:val="20"/>
+          <w:szCs w:val="20"/>
+        </w:rPr>
+        <w:lastRenderedPageBreak/>
         <w:t>Blade type</w:t>
       </w:r>
     </w:p>
@@ -972,14 +972,14 @@
         <w:spacing w:after="0" w:line="240" w:lineRule="auto"/>
         <w:ind w:left="765" w:hanging="357"/>
         <w:rPr>
-          <w:sz w:val="21"/>
-          <w:szCs w:val="21"/>
-        </w:rPr>
-      </w:pPr>
-      <w:r>
-        <w:rPr>
-          <w:sz w:val="21"/>
-          <w:szCs w:val="21"/>
+          <w:sz w:val="20"/>
+          <w:szCs w:val="20"/>
+        </w:rPr>
+      </w:pPr>
+      <w:r>
+        <w:rPr>
+          <w:sz w:val="20"/>
+          <w:szCs w:val="20"/>
         </w:rPr>
         <w:t>Additional info</w:t>
       </w:r>
@@ -988,14 +988,14 @@
       <w:pPr>
         <w:spacing w:after="80" w:line="240" w:lineRule="auto"/>
         <w:rPr>
-          <w:sz w:val="21"/>
-          <w:szCs w:val="21"/>
-        </w:rPr>
-      </w:pPr>
-      <w:r>
-        <w:rPr>
-          <w:sz w:val="21"/>
-          <w:szCs w:val="21"/>
+          <w:sz w:val="20"/>
+          <w:szCs w:val="20"/>
+        </w:rPr>
+      </w:pPr>
+      <w:r>
+        <w:rPr>
+          <w:sz w:val="20"/>
+          <w:szCs w:val="20"/>
         </w:rPr>
         <w:t>User:</w:t>
       </w:r>
@@ -1010,14 +1010,14 @@
         <w:spacing w:after="0" w:line="240" w:lineRule="auto"/>
         <w:ind w:left="714" w:hanging="357"/>
         <w:rPr>
-          <w:sz w:val="21"/>
-          <w:szCs w:val="21"/>
-        </w:rPr>
-      </w:pPr>
-      <w:r>
-        <w:rPr>
-          <w:sz w:val="21"/>
-          <w:szCs w:val="21"/>
+          <w:sz w:val="20"/>
+          <w:szCs w:val="20"/>
+        </w:rPr>
+      </w:pPr>
+      <w:r>
+        <w:rPr>
+          <w:sz w:val="20"/>
+          <w:szCs w:val="20"/>
         </w:rPr>
         <w:t>Name</w:t>
       </w:r>
@@ -1032,14 +1032,14 @@
         <w:spacing w:after="0" w:line="240" w:lineRule="auto"/>
         <w:ind w:left="714" w:hanging="357"/>
         <w:rPr>
-          <w:sz w:val="21"/>
-          <w:szCs w:val="21"/>
-        </w:rPr>
-      </w:pPr>
-      <w:r>
-        <w:rPr>
-          <w:sz w:val="21"/>
-          <w:szCs w:val="21"/>
+          <w:sz w:val="20"/>
+          <w:szCs w:val="20"/>
+        </w:rPr>
+      </w:pPr>
+      <w:r>
+        <w:rPr>
+          <w:sz w:val="20"/>
+          <w:szCs w:val="20"/>
         </w:rPr>
         <w:t xml:space="preserve">Username </w:t>
       </w:r>
@@ -1054,14 +1054,14 @@
         <w:spacing w:after="0" w:line="240" w:lineRule="auto"/>
         <w:ind w:left="714" w:hanging="357"/>
         <w:rPr>
-          <w:sz w:val="21"/>
-          <w:szCs w:val="21"/>
-        </w:rPr>
-      </w:pPr>
-      <w:r>
-        <w:rPr>
-          <w:sz w:val="21"/>
-          <w:szCs w:val="21"/>
+          <w:sz w:val="20"/>
+          <w:szCs w:val="20"/>
+        </w:rPr>
+      </w:pPr>
+      <w:r>
+        <w:rPr>
+          <w:sz w:val="20"/>
+          <w:szCs w:val="20"/>
         </w:rPr>
         <w:t xml:space="preserve">Password </w:t>
       </w:r>
@@ -1076,14 +1076,14 @@
         <w:spacing w:after="0" w:line="240" w:lineRule="auto"/>
         <w:ind w:left="714" w:hanging="357"/>
         <w:rPr>
-          <w:sz w:val="21"/>
-          <w:szCs w:val="21"/>
-        </w:rPr>
-      </w:pPr>
-      <w:r>
-        <w:rPr>
-          <w:sz w:val="21"/>
-          <w:szCs w:val="21"/>
+          <w:sz w:val="20"/>
+          <w:szCs w:val="20"/>
+        </w:rPr>
+      </w:pPr>
+      <w:r>
+        <w:rPr>
+          <w:sz w:val="20"/>
+          <w:szCs w:val="20"/>
         </w:rPr>
         <w:t xml:space="preserve">Access level </w:t>
       </w:r>
@@ -1092,14 +1092,14 @@
       <w:pPr>
         <w:spacing w:after="80" w:line="240" w:lineRule="auto"/>
         <w:rPr>
-          <w:sz w:val="21"/>
-          <w:szCs w:val="21"/>
-        </w:rPr>
-      </w:pPr>
-      <w:r>
-        <w:rPr>
-          <w:sz w:val="21"/>
-          <w:szCs w:val="21"/>
+          <w:sz w:val="20"/>
+          <w:szCs w:val="20"/>
+        </w:rPr>
+      </w:pPr>
+      <w:r>
+        <w:rPr>
+          <w:sz w:val="20"/>
+          <w:szCs w:val="20"/>
         </w:rPr>
         <w:t>Bookings:</w:t>
       </w:r>
@@ -1114,14 +1114,14 @@
         <w:spacing w:after="0" w:line="240" w:lineRule="auto"/>
         <w:ind w:left="714" w:hanging="357"/>
         <w:rPr>
-          <w:sz w:val="21"/>
-          <w:szCs w:val="21"/>
-        </w:rPr>
-      </w:pPr>
-      <w:r>
-        <w:rPr>
-          <w:sz w:val="21"/>
-          <w:szCs w:val="21"/>
+          <w:sz w:val="20"/>
+          <w:szCs w:val="20"/>
+        </w:rPr>
+      </w:pPr>
+      <w:r>
+        <w:rPr>
+          <w:sz w:val="20"/>
+          <w:szCs w:val="20"/>
         </w:rPr>
         <w:t>Booking date and time</w:t>
       </w:r>
@@ -1136,14 +1136,14 @@
         <w:spacing w:after="0" w:line="240" w:lineRule="auto"/>
         <w:ind w:left="714" w:hanging="357"/>
         <w:rPr>
-          <w:sz w:val="21"/>
-          <w:szCs w:val="21"/>
-        </w:rPr>
-      </w:pPr>
-      <w:r>
-        <w:rPr>
-          <w:sz w:val="21"/>
-          <w:szCs w:val="21"/>
+          <w:sz w:val="20"/>
+          <w:szCs w:val="20"/>
+        </w:rPr>
+      </w:pPr>
+      <w:r>
+        <w:rPr>
+          <w:sz w:val="20"/>
+          <w:szCs w:val="20"/>
         </w:rPr>
         <w:t>Boat/equipment booked</w:t>
       </w:r>
@@ -1158,14 +1158,14 @@
         <w:spacing w:after="0" w:line="240" w:lineRule="auto"/>
         <w:ind w:left="714" w:hanging="357"/>
         <w:rPr>
-          <w:sz w:val="21"/>
-          <w:szCs w:val="21"/>
-        </w:rPr>
-      </w:pPr>
-      <w:r>
-        <w:rPr>
-          <w:sz w:val="21"/>
-          <w:szCs w:val="21"/>
+          <w:sz w:val="20"/>
+          <w:szCs w:val="20"/>
+        </w:rPr>
+      </w:pPr>
+      <w:r>
+        <w:rPr>
+          <w:sz w:val="20"/>
+          <w:szCs w:val="20"/>
         </w:rPr>
         <w:t xml:space="preserve">Booking duration </w:t>
       </w:r>
@@ -1180,6 +1180,62 @@
         <w:spacing w:after="0" w:line="240" w:lineRule="auto"/>
         <w:ind w:left="714" w:hanging="357"/>
         <w:rPr>
+          <w:sz w:val="20"/>
+          <w:szCs w:val="20"/>
+        </w:rPr>
+      </w:pPr>
+      <w:r>
+        <w:rPr>
+          <w:sz w:val="20"/>
+          <w:szCs w:val="20"/>
+        </w:rPr>
+        <w:t>Booked by</w:t>
+      </w:r>
+    </w:p>
+    <w:p>
+      <w:pPr>
+        <w:spacing w:after="0" w:line="240" w:lineRule="auto"/>
+        <w:rPr>
+          <w:sz w:val="20"/>
+          <w:szCs w:val="20"/>
+        </w:rPr>
+      </w:pPr>
+    </w:p>
+    <w:p>
+      <w:pPr>
+        <w:spacing w:after="80" w:line="240" w:lineRule="auto"/>
+        <w:rPr>
+          <w:sz w:val="20"/>
+          <w:szCs w:val="20"/>
+        </w:rPr>
+      </w:pPr>
+      <w:r>
+        <w:rPr>
+          <w:sz w:val="20"/>
+          <w:szCs w:val="20"/>
+        </w:rPr>
+        <w:t>Is there any other information</w:t>
+      </w:r>
+      <w:r>
+        <w:rPr>
+          <w:sz w:val="20"/>
+          <w:szCs w:val="20"/>
+        </w:rPr>
+        <w:t xml:space="preserve"> that should be included</w:t>
+      </w:r>
+      <w:r>
+        <w:rPr>
+          <w:sz w:val="20"/>
+          <w:szCs w:val="20"/>
+        </w:rPr>
+        <w:t>?</w:t>
+      </w:r>
+    </w:p>
+    <w:p>
+      <w:pPr>
+        <w:pStyle w:val="Subtitle"/>
+        <w:spacing w:after="80" w:line="240" w:lineRule="auto"/>
+        <w:rPr>
           <w:sz w:val="21"/>
           <w:szCs w:val="21"/>
         </w:rPr>
@@ -1189,62 +1245,6 @@
           <w:sz w:val="21"/>
           <w:szCs w:val="21"/>
         </w:rPr>
-        <w:t>Booked by</w:t>
-      </w:r>
-    </w:p>
-    <w:p>
-      <w:pPr>
-        <w:spacing w:after="0" w:line="240" w:lineRule="auto"/>
-        <w:rPr>
-          <w:sz w:val="21"/>
-          <w:szCs w:val="21"/>
-        </w:rPr>
-      </w:pPr>
-    </w:p>
-    <w:p>
-      <w:pPr>
-        <w:spacing w:after="80" w:line="240" w:lineRule="auto"/>
-        <w:rPr>
-          <w:sz w:val="21"/>
-          <w:szCs w:val="21"/>
-        </w:rPr>
-      </w:pPr>
-      <w:r>
-        <w:rPr>
-          <w:sz w:val="21"/>
-          <w:szCs w:val="21"/>
-        </w:rPr>
-        <w:t>Is there any other information</w:t>
-      </w:r>
-      <w:r>
-        <w:rPr>
-          <w:sz w:val="21"/>
-          <w:szCs w:val="21"/>
-        </w:rPr>
-        <w:t xml:space="preserve"> that should be included</w:t>
-      </w:r>
-      <w:r>
-        <w:rPr>
-          <w:sz w:val="21"/>
-          <w:szCs w:val="21"/>
-        </w:rPr>
-        <w:t>?</w:t>
-      </w:r>
-    </w:p>
-    <w:p>
-      <w:pPr>
-        <w:pStyle w:val="Subtitle"/>
-        <w:spacing w:after="80" w:line="240" w:lineRule="auto"/>
-        <w:rPr>
-          <w:sz w:val="22"/>
-          <w:szCs w:val="22"/>
-        </w:rPr>
-      </w:pPr>
-      <w:r>
-        <w:rPr>
-          <w:sz w:val="22"/>
-          <w:szCs w:val="22"/>
-        </w:rPr>
         <w:t>User experience timeline:</w:t>
       </w:r>
     </w:p>
@@ -1253,28 +1253,28 @@
         <w:pStyle w:val="NoSpacing"/>
         <w:spacing w:after="80"/>
         <w:rPr>
-          <w:sz w:val="21"/>
-          <w:szCs w:val="21"/>
-        </w:rPr>
-      </w:pPr>
-      <w:r>
-        <w:rPr>
-          <w:sz w:val="21"/>
-          <w:szCs w:val="21"/>
+          <w:sz w:val="20"/>
+          <w:szCs w:val="20"/>
+        </w:rPr>
+      </w:pPr>
+      <w:r>
+        <w:rPr>
+          <w:sz w:val="20"/>
+          <w:szCs w:val="20"/>
         </w:rPr>
         <w:t>The following</w:t>
       </w:r>
       <w:r>
         <w:rPr>
-          <w:sz w:val="21"/>
-          <w:szCs w:val="21"/>
+          <w:sz w:val="20"/>
+          <w:szCs w:val="20"/>
         </w:rPr>
         <w:t xml:space="preserve"> image</w:t>
       </w:r>
       <w:r>
         <w:rPr>
-          <w:sz w:val="21"/>
-          <w:szCs w:val="21"/>
+          <w:sz w:val="20"/>
+          <w:szCs w:val="20"/>
         </w:rPr>
         <w:t xml:space="preserve"> is the suggested path a user may take through the system.</w:t>
       </w:r>
@@ -1284,8 +1284,8 @@
         <w:pStyle w:val="NoSpacing"/>
         <w:spacing w:after="80"/>
         <w:rPr>
-          <w:sz w:val="21"/>
-          <w:szCs w:val="21"/>
+          <w:sz w:val="20"/>
+          <w:szCs w:val="20"/>
         </w:rPr>
       </w:pPr>
     </w:p>
@@ -1294,14 +1294,14 @@
         <w:pStyle w:val="NoSpacing"/>
         <w:spacing w:after="80"/>
         <w:rPr>
-          <w:sz w:val="21"/>
-          <w:szCs w:val="21"/>
-        </w:rPr>
-      </w:pPr>
-      <w:r>
-        <w:rPr>
-          <w:sz w:val="21"/>
-          <w:szCs w:val="21"/>
+          <w:sz w:val="20"/>
+          <w:szCs w:val="20"/>
+        </w:rPr>
+      </w:pPr>
+      <w:r>
+        <w:rPr>
+          <w:sz w:val="20"/>
+          <w:szCs w:val="20"/>
         </w:rPr>
         <w:drawing>
           <wp:inline distT="0" distB="0" distL="0" distR="0" wp14:anchorId="73EF3900" wp14:editId="165BC7F6">
@@ -1345,38 +1345,38 @@
         <w:pStyle w:val="NoSpacing"/>
         <w:spacing w:after="80"/>
         <w:rPr>
+          <w:sz w:val="20"/>
+          <w:szCs w:val="20"/>
+        </w:rPr>
+      </w:pPr>
+    </w:p>
+    <w:p>
+      <w:pPr>
+        <w:pStyle w:val="Subtitle"/>
+        <w:spacing w:after="80" w:line="240" w:lineRule="auto"/>
+        <w:rPr>
           <w:sz w:val="21"/>
           <w:szCs w:val="21"/>
         </w:rPr>
       </w:pPr>
-    </w:p>
-    <w:p>
-      <w:pPr>
-        <w:pStyle w:val="Subtitle"/>
-        <w:spacing w:after="80" w:line="240" w:lineRule="auto"/>
-        <w:rPr>
-          <w:sz w:val="22"/>
-          <w:szCs w:val="22"/>
-        </w:rPr>
-      </w:pPr>
-      <w:r>
-        <w:rPr>
-          <w:sz w:val="22"/>
-          <w:szCs w:val="22"/>
+      <w:r>
+        <w:rPr>
+          <w:sz w:val="21"/>
+          <w:szCs w:val="21"/>
         </w:rPr>
         <w:t>Clarification</w:t>
       </w:r>
       <w:r>
         <w:rPr>
-          <w:sz w:val="22"/>
-          <w:szCs w:val="22"/>
+          <w:sz w:val="21"/>
+          <w:szCs w:val="21"/>
         </w:rPr>
         <w:t xml:space="preserve"> required</w:t>
       </w:r>
       <w:r>
         <w:rPr>
-          <w:sz w:val="22"/>
-          <w:szCs w:val="22"/>
+          <w:sz w:val="21"/>
+          <w:szCs w:val="21"/>
         </w:rPr>
         <w:t>:</w:t>
       </w:r>
@@ -1389,42 +1389,42 @@
           <w:numId w:val="8"/>
         </w:numPr>
         <w:rPr>
-          <w:sz w:val="21"/>
-          <w:szCs w:val="21"/>
-        </w:rPr>
-      </w:pPr>
-      <w:r>
-        <w:rPr>
-          <w:sz w:val="21"/>
-          <w:szCs w:val="21"/>
+          <w:sz w:val="20"/>
+          <w:szCs w:val="20"/>
+        </w:rPr>
+      </w:pPr>
+      <w:r>
+        <w:rPr>
+          <w:sz w:val="20"/>
+          <w:szCs w:val="20"/>
         </w:rPr>
         <w:t xml:space="preserve">Would </w:t>
       </w:r>
       <w:r>
         <w:rPr>
-          <w:sz w:val="21"/>
-          <w:szCs w:val="21"/>
+          <w:sz w:val="20"/>
+          <w:szCs w:val="20"/>
         </w:rPr>
         <w:t xml:space="preserve">users need to select blades to go with a boat when booking </w:t>
       </w:r>
       <w:r>
         <w:rPr>
-          <w:sz w:val="21"/>
-          <w:szCs w:val="21"/>
+          <w:sz w:val="20"/>
+          <w:szCs w:val="20"/>
         </w:rPr>
         <w:t xml:space="preserve">to prevent clashes (if there are some blades used by more than one boat) </w:t>
       </w:r>
       <w:r>
         <w:rPr>
-          <w:sz w:val="21"/>
-          <w:szCs w:val="21"/>
+          <w:sz w:val="20"/>
+          <w:szCs w:val="20"/>
         </w:rPr>
         <w:t>or can the list of blades for each boat be purely informational</w:t>
       </w:r>
       <w:r>
         <w:rPr>
-          <w:sz w:val="21"/>
-          <w:szCs w:val="21"/>
+          <w:sz w:val="20"/>
+          <w:szCs w:val="20"/>
         </w:rPr>
         <w:t>?</w:t>
       </w:r>
@@ -1437,21 +1437,21 @@
           <w:numId w:val="8"/>
         </w:numPr>
         <w:rPr>
-          <w:sz w:val="21"/>
-          <w:szCs w:val="21"/>
-        </w:rPr>
-      </w:pPr>
-      <w:r>
-        <w:rPr>
-          <w:sz w:val="21"/>
-          <w:szCs w:val="21"/>
+          <w:sz w:val="20"/>
+          <w:szCs w:val="20"/>
+        </w:rPr>
+      </w:pPr>
+      <w:r>
+        <w:rPr>
+          <w:sz w:val="20"/>
+          <w:szCs w:val="20"/>
         </w:rPr>
         <w:t>Will the non-boat booking section include only the ergs or the other gym equipment?</w:t>
       </w:r>
       <w:r>
         <w:rPr>
-          <w:sz w:val="21"/>
-          <w:szCs w:val="21"/>
+          <w:sz w:val="20"/>
+          <w:szCs w:val="20"/>
         </w:rPr>
         <w:t xml:space="preserve"> If so, what other equipment?</w:t>
       </w:r>
@@ -1464,14 +1464,14 @@
           <w:numId w:val="8"/>
         </w:numPr>
         <w:rPr>
-          <w:sz w:val="21"/>
-          <w:szCs w:val="21"/>
-        </w:rPr>
-      </w:pPr>
-      <w:r>
-        <w:rPr>
-          <w:sz w:val="21"/>
-          <w:szCs w:val="21"/>
+          <w:sz w:val="20"/>
+          <w:szCs w:val="20"/>
+        </w:rPr>
+      </w:pPr>
+      <w:r>
+        <w:rPr>
+          <w:sz w:val="20"/>
+          <w:szCs w:val="20"/>
         </w:rPr>
         <w:t>What information needs to be stored about the ergs and or other equipment in the gym?</w:t>
       </w:r>
@@ -1484,49 +1484,58 @@
           <w:numId w:val="8"/>
         </w:numPr>
         <w:rPr>
-          <w:sz w:val="21"/>
-          <w:szCs w:val="21"/>
-        </w:rPr>
-      </w:pPr>
-      <w:r>
-        <w:rPr>
-          <w:sz w:val="21"/>
-          <w:szCs w:val="21"/>
+          <w:sz w:val="20"/>
+          <w:szCs w:val="20"/>
+        </w:rPr>
+      </w:pPr>
+      <w:r>
+        <w:rPr>
+          <w:sz w:val="20"/>
+          <w:szCs w:val="20"/>
         </w:rPr>
         <w:t>Should</w:t>
       </w:r>
       <w:r>
         <w:rPr>
-          <w:sz w:val="21"/>
-          <w:szCs w:val="21"/>
-        </w:rPr>
-        <w:t xml:space="preserve"> admin logins to also work for boat booking</w:t>
-      </w:r>
-      <w:r>
-        <w:rPr>
-          <w:sz w:val="21"/>
-          <w:szCs w:val="21"/>
+          <w:sz w:val="20"/>
+          <w:szCs w:val="20"/>
+        </w:rPr>
+        <w:t xml:space="preserve"> admin logins also work for boat </w:t>
+      </w:r>
+      <w:proofErr w:type="gramStart"/>
+      <w:r>
+        <w:rPr>
+          <w:sz w:val="20"/>
+          <w:szCs w:val="20"/>
+        </w:rPr>
+        <w:t>booking</w:t>
+      </w:r>
+      <w:proofErr w:type="gramEnd"/>
+      <w:r>
+        <w:rPr>
+          <w:sz w:val="20"/>
+          <w:szCs w:val="20"/>
         </w:rPr>
         <w:t xml:space="preserve"> or should each admin </w:t>
       </w:r>
       <w:r>
         <w:rPr>
-          <w:sz w:val="21"/>
-          <w:szCs w:val="21"/>
+          <w:sz w:val="20"/>
+          <w:szCs w:val="20"/>
         </w:rPr>
         <w:t xml:space="preserve">have a separate login </w:t>
       </w:r>
       <w:r>
         <w:rPr>
-          <w:sz w:val="21"/>
-          <w:szCs w:val="21"/>
+          <w:sz w:val="20"/>
+          <w:szCs w:val="20"/>
         </w:rPr>
         <w:t>for when they make bookings</w:t>
       </w:r>
       <w:r>
         <w:rPr>
-          <w:sz w:val="21"/>
-          <w:szCs w:val="21"/>
+          <w:sz w:val="20"/>
+          <w:szCs w:val="20"/>
         </w:rPr>
         <w:t>?</w:t>
       </w:r>
@@ -1539,49 +1548,49 @@
           <w:numId w:val="8"/>
         </w:numPr>
         <w:rPr>
-          <w:sz w:val="21"/>
-          <w:szCs w:val="21"/>
-        </w:rPr>
-      </w:pPr>
-      <w:r>
-        <w:rPr>
-          <w:sz w:val="21"/>
-          <w:szCs w:val="21"/>
+          <w:sz w:val="20"/>
+          <w:szCs w:val="20"/>
+        </w:rPr>
+      </w:pPr>
+      <w:r>
+        <w:rPr>
+          <w:sz w:val="20"/>
+          <w:szCs w:val="20"/>
         </w:rPr>
         <w:t>When viewing the schedule of bookings, what timelines are desirable (</w:t>
       </w:r>
       <w:r>
         <w:rPr>
-          <w:sz w:val="21"/>
-          <w:szCs w:val="21"/>
+          <w:sz w:val="20"/>
+          <w:szCs w:val="20"/>
         </w:rPr>
         <w:t>1</w:t>
       </w:r>
       <w:r>
         <w:rPr>
-          <w:sz w:val="21"/>
-          <w:szCs w:val="21"/>
+          <w:sz w:val="20"/>
+          <w:szCs w:val="20"/>
         </w:rPr>
         <w:t>-</w:t>
       </w:r>
       <w:r>
         <w:rPr>
-          <w:sz w:val="21"/>
-          <w:szCs w:val="21"/>
+          <w:sz w:val="20"/>
+          <w:szCs w:val="20"/>
         </w:rPr>
         <w:t xml:space="preserve">day, </w:t>
       </w:r>
       <w:r>
         <w:rPr>
-          <w:sz w:val="21"/>
-          <w:szCs w:val="21"/>
+          <w:sz w:val="20"/>
+          <w:szCs w:val="20"/>
         </w:rPr>
         <w:t>3-day</w:t>
       </w:r>
       <w:r>
         <w:rPr>
-          <w:sz w:val="21"/>
-          <w:szCs w:val="21"/>
+          <w:sz w:val="20"/>
+          <w:szCs w:val="20"/>
         </w:rPr>
         <w:t>, week)?</w:t>
       </w:r>
@@ -1594,35 +1603,35 @@
           <w:numId w:val="8"/>
         </w:numPr>
         <w:rPr>
-          <w:sz w:val="21"/>
-          <w:szCs w:val="21"/>
-        </w:rPr>
-      </w:pPr>
-      <w:r>
-        <w:rPr>
-          <w:sz w:val="21"/>
-          <w:szCs w:val="21"/>
+          <w:sz w:val="20"/>
+          <w:szCs w:val="20"/>
+        </w:rPr>
+      </w:pPr>
+      <w:r>
+        <w:rPr>
+          <w:sz w:val="20"/>
+          <w:szCs w:val="20"/>
         </w:rPr>
         <w:t>Should all users be able to see who has made a booking or just the booking</w:t>
       </w:r>
       <w:r>
         <w:rPr>
-          <w:sz w:val="21"/>
-          <w:szCs w:val="21"/>
+          <w:sz w:val="20"/>
+          <w:szCs w:val="20"/>
         </w:rPr>
         <w:t xml:space="preserve"> </w:t>
       </w:r>
       <w:r>
         <w:rPr>
-          <w:sz w:val="21"/>
-          <w:szCs w:val="21"/>
+          <w:sz w:val="20"/>
+          <w:szCs w:val="20"/>
         </w:rPr>
         <w:t>time and boat/equipment</w:t>
       </w:r>
       <w:r>
         <w:rPr>
-          <w:sz w:val="21"/>
-          <w:szCs w:val="21"/>
+          <w:sz w:val="20"/>
+          <w:szCs w:val="20"/>
         </w:rPr>
         <w:t>?</w:t>
       </w:r>
@@ -1635,14 +1644,14 @@
           <w:numId w:val="8"/>
         </w:numPr>
         <w:rPr>
-          <w:sz w:val="21"/>
-          <w:szCs w:val="21"/>
-        </w:rPr>
-      </w:pPr>
-      <w:r>
-        <w:rPr>
-          <w:sz w:val="21"/>
-          <w:szCs w:val="21"/>
+          <w:sz w:val="20"/>
+          <w:szCs w:val="20"/>
+        </w:rPr>
+      </w:pPr>
+      <w:r>
+        <w:rPr>
+          <w:sz w:val="20"/>
+          <w:szCs w:val="20"/>
         </w:rPr>
         <w:t>Are there some boats that are for public use but only with permission from captains? If so, should these bookings be approved with an email notification sent to the captains?</w:t>
       </w:r>
@@ -1655,28 +1664,28 @@
           <w:numId w:val="8"/>
         </w:numPr>
         <w:rPr>
-          <w:sz w:val="21"/>
-          <w:szCs w:val="21"/>
-        </w:rPr>
-      </w:pPr>
-      <w:r>
-        <w:rPr>
-          <w:sz w:val="21"/>
-          <w:szCs w:val="21"/>
+          <w:sz w:val="20"/>
+          <w:szCs w:val="20"/>
+        </w:rPr>
+      </w:pPr>
+      <w:r>
+        <w:rPr>
+          <w:sz w:val="20"/>
+          <w:szCs w:val="20"/>
         </w:rPr>
         <w:t>What should the name of the booking system be</w:t>
       </w:r>
       <w:r>
         <w:rPr>
-          <w:sz w:val="21"/>
-          <w:szCs w:val="21"/>
+          <w:sz w:val="20"/>
+          <w:szCs w:val="20"/>
         </w:rPr>
         <w:t xml:space="preserve"> and where should it be accessed from</w:t>
       </w:r>
       <w:r>
         <w:rPr>
-          <w:sz w:val="21"/>
-          <w:szCs w:val="21"/>
+          <w:sz w:val="20"/>
+          <w:szCs w:val="20"/>
         </w:rPr>
         <w:t xml:space="preserve">? </w:t>
       </w:r>
@@ -1689,6 +1698,82 @@
           <w:numId w:val="8"/>
         </w:numPr>
         <w:rPr>
+          <w:sz w:val="20"/>
+          <w:szCs w:val="20"/>
+        </w:rPr>
+      </w:pPr>
+      <w:r>
+        <w:rPr>
+          <w:sz w:val="20"/>
+          <w:szCs w:val="20"/>
+        </w:rPr>
+        <w:t>How long should past bookings be kept for?</w:t>
+      </w:r>
+      <w:r>
+        <w:rPr>
+          <w:sz w:val="20"/>
+          <w:szCs w:val="20"/>
+        </w:rPr>
+        <w:br/>
+      </w:r>
+    </w:p>
+    <w:p>
+      <w:pPr>
+        <w:pStyle w:val="NoSpacing"/>
+        <w:rPr>
+          <w:sz w:val="20"/>
+          <w:szCs w:val="20"/>
+        </w:rPr>
+      </w:pPr>
+      <w:r>
+        <w:rPr>
+          <w:sz w:val="20"/>
+          <w:szCs w:val="20"/>
+        </w:rPr>
+        <w:t xml:space="preserve">What other features </w:t>
+      </w:r>
+      <w:r>
+        <w:rPr>
+          <w:sz w:val="20"/>
+          <w:szCs w:val="20"/>
+        </w:rPr>
+        <w:t>are expected</w:t>
+      </w:r>
+      <w:r>
+        <w:rPr>
+          <w:sz w:val="20"/>
+          <w:szCs w:val="20"/>
+        </w:rPr>
+        <w:t xml:space="preserve"> of the system?</w:t>
+      </w:r>
+    </w:p>
+    <w:p>
+      <w:pPr>
+        <w:pStyle w:val="NoSpacing"/>
+        <w:rPr>
+          <w:sz w:val="20"/>
+          <w:szCs w:val="20"/>
+        </w:rPr>
+      </w:pPr>
+    </w:p>
+    <w:p>
+      <w:pPr>
+        <w:pStyle w:val="Subtitle"/>
+      </w:pPr>
+      <w:r>
+        <w:t>User Interface</w:t>
+      </w:r>
+    </w:p>
+    <w:p>
+      <w:pPr>
+        <w:pStyle w:val="ListParagraph"/>
+        <w:numPr>
+          <w:ilvl w:val="0"/>
+          <w:numId w:val="21"/>
+        </w:numPr>
+        <w:spacing w:after="0"/>
+        <w:ind w:left="714" w:hanging="357"/>
+        <w:rPr>
           <w:sz w:val="21"/>
           <w:szCs w:val="21"/>
         </w:rPr>
@@ -1698,44 +1783,43 @@
           <w:sz w:val="21"/>
           <w:szCs w:val="21"/>
         </w:rPr>
-        <w:t>How long should past bookings be kept for?</w:t>
+        <w:t xml:space="preserve">What requirements can be placed on the visual aspects of the </w:t>
       </w:r>
       <w:r>
         <w:rPr>
           <w:sz w:val="21"/>
           <w:szCs w:val="21"/>
         </w:rPr>
-        <w:br/>
-      </w:r>
-    </w:p>
-    <w:p>
-      <w:pPr>
-        <w:pStyle w:val="NoSpacing"/>
+        <w:t>system</w:t>
+      </w:r>
+      <w:r>
         <w:rPr>
           <w:sz w:val="21"/>
           <w:szCs w:val="21"/>
         </w:rPr>
-      </w:pPr>
-      <w:r>
+        <w:t>?</w:t>
+      </w:r>
+    </w:p>
+    <w:p>
+      <w:pPr>
+        <w:pStyle w:val="ListParagraph"/>
+        <w:numPr>
+          <w:ilvl w:val="0"/>
+          <w:numId w:val="21"/>
+        </w:numPr>
+        <w:spacing w:after="0"/>
+        <w:ind w:left="714" w:hanging="357"/>
         <w:rPr>
           <w:sz w:val="21"/>
           <w:szCs w:val="21"/>
         </w:rPr>
-        <w:t xml:space="preserve">What other features </w:t>
-      </w:r>
+      </w:pPr>
       <w:r>
         <w:rPr>
           <w:sz w:val="21"/>
           <w:szCs w:val="21"/>
         </w:rPr>
-        <w:t>are expected</w:t>
-      </w:r>
-      <w:r>
-        <w:rPr>
-          <w:sz w:val="21"/>
-          <w:szCs w:val="21"/>
-        </w:rPr>
-        <w:t xml:space="preserve"> of the system?</w:t>
+        <w:t>How should the system look?</w:t>
       </w:r>
     </w:p>
     <w:sectPr>
@@ -1751,6 +1835,119 @@
 <file path=word/numbering.xml><?xml version="1.0" encoding="utf-8"?>
 <w:numbering xmlns:wpc="http://schemas.microsoft.com/office/word/2010/wordprocessingCanvas" xmlns:cx="http://schemas.microsoft.com/office/drawing/2014/chartex" xmlns:cx1="http://schemas.microsoft.com/office/drawing/2015/9/8/chartex" xmlns:cx2="http://schemas.microsoft.com/office/drawing/2015/10/21/chartex" xmlns:cx3="http://schemas.microsoft.com/office/drawing/2016/5/9/chartex" xmlns:cx4="http://schemas.microsoft.com/office/drawing/2016/5/10/chartex" xmlns:cx5="http://schemas.microsoft.com/office/drawing/2016/5/11/chartex" xmlns:cx6="http://schemas.microsoft.com/office/drawing/2016/5/12/chartex" xmlns:cx7="http://schemas.microsoft.com/office/drawing/2016/5/13/chartex" xmlns:cx8="http://schemas.microsoft.com/office/drawing/2016/5/14/chartex" xmlns:mc="http://schemas.openxmlformats.org/markup-compatibility/2006" xmlns:m="http://schemas.openxmlformats.org/officeDocument/2006/math" xmlns:aink="http://schemas.microsoft.com/office/drawing/2016/ink" xmlns:am3d="http://schemas.microsoft.com/office/drawing/2017/model3d" xmlns:oel="http://schemas.microsoft.com/office/2019/extlst" xmlns:r="http://schemas.openxmlformats.org/officeDocument/2006/relationships" xmlns:wp14="http://schemas.microsoft.com/office/word/2010/wordprocessingDrawing" xmlns:wp="http://schemas.openxmlformats.org/drawingml/2006/wordprocessingDrawing" xmlns:wpg="http://schemas.microsoft.com/office/word/2010/wordprocessingGroup" xmlns:wpi="http://schemas.microsoft.com/office/word/2010/wordprocessingInk" xmlns:wps="http://schemas.microsoft.com/office/word/2010/wordprocessingShape" xmlns:o="urn:schemas-microsoft-com:office:office" xmlns:v="urn:schemas-microsoft-com:vml" xmlns:w10="urn:schemas-microsoft-com:office:word" xmlns:w="http://schemas.openxmlformats.org/wordprocessingml/2006/main" xmlns:w14="http://schemas.microsoft.com/office/word/2010/wordml" xmlns:w15="http://schemas.microsoft.com/office/word/2012/wordml" xmlns:w16cex="http://schemas.microsoft.com/office/word/2018/wordml/cex" xmlns:w16cid="http://schemas.microsoft.com/office/word/2016/wordml/cid" xmlns:w16="http://schemas.microsoft.com/office/word/2018/wordml" xmlns:w16sdtdh="http://schemas.microsoft.com/office/word/2020/wordml/sdtdatahash" xmlns:w16sdtfl="http://schemas.microsoft.com/office/word/2024/wordml/sdtformatlock" xmlns:w16se="http://schemas.microsoft.com/office/word/2015/wordml/symex" xmlns:w16du="http://schemas.microsoft.com/office/word/2023/wordml/word16du" xmlns:wne="http://schemas.microsoft.com/office/word/2006/wordml" mc:Ignorable="w14 w15 w16se w16cid w16 w16cex w16sdtdh w16sdtfl w16du wp14">
   <w:abstractNum w:abstractNumId="0" w15:restartNumberingAfterBreak="0">
+    <w:nsid w:val="05D8557B"/>
+    <w:multiLevelType w:val="hybridMultilevel"/>
+    <w:tmpl w:val="1FAA1D20"/>
+    <w:lvl w:ilvl="0" w:tplc="41C47320">
+      <w:start w:val="1"/>
+      <w:numFmt w:val="bullet"/>
+      <w:lvlText w:val=""/>
+      <w:lvlJc w:val="left"/>
+      <w:pPr>
+        <w:ind w:left="720" w:hanging="360"/>
+      </w:pPr>
+      <w:rPr>
+        <w:rFonts w:ascii="Symbol" w:hAnsi="Symbol" w:hint="default"/>
+      </w:rPr>
+    </w:lvl>
+    <w:lvl w:ilvl="1" w:tplc="08090003" w:tentative="1">
+      <w:start w:val="1"/>
+      <w:numFmt w:val="bullet"/>
+      <w:lvlText w:val="o"/>
+      <w:lvlJc w:val="left"/>
+      <w:pPr>
+        <w:ind w:left="1440" w:hanging="360"/>
+      </w:pPr>
+      <w:rPr>
+        <w:rFonts w:ascii="Courier New" w:hAnsi="Courier New" w:cs="Courier New" w:hint="default"/>
+      </w:rPr>
+    </w:lvl>
+    <w:lvl w:ilvl="2" w:tplc="08090005" w:tentative="1">
+      <w:start w:val="1"/>
+      <w:numFmt w:val="bullet"/>
+      <w:lvlText w:val=""/>
+      <w:lvlJc w:val="left"/>
+      <w:pPr>
+        <w:ind w:left="2160" w:hanging="360"/>
+      </w:pPr>
+      <w:rPr>
+        <w:rFonts w:ascii="Wingdings" w:hAnsi="Wingdings" w:hint="default"/>
+      </w:rPr>
+    </w:lvl>
+    <w:lvl w:ilvl="3" w:tplc="08090001" w:tentative="1">
+      <w:start w:val="1"/>
+      <w:numFmt w:val="bullet"/>
+      <w:lvlText w:val=""/>
+      <w:lvlJc w:val="left"/>
+      <w:pPr>
+        <w:ind w:left="2880" w:hanging="360"/>
+      </w:pPr>
+      <w:rPr>
+        <w:rFonts w:ascii="Symbol" w:hAnsi="Symbol" w:hint="default"/>
+      </w:rPr>
+    </w:lvl>
+    <w:lvl w:ilvl="4" w:tplc="08090003" w:tentative="1">
+      <w:start w:val="1"/>
+      <w:numFmt w:val="bullet"/>
+      <w:lvlText w:val="o"/>
+      <w:lvlJc w:val="left"/>
+      <w:pPr>
+        <w:ind w:left="3600" w:hanging="360"/>
+      </w:pPr>
+      <w:rPr>
+        <w:rFonts w:ascii="Courier New" w:hAnsi="Courier New" w:cs="Courier New" w:hint="default"/>
+      </w:rPr>
+    </w:lvl>
+    <w:lvl w:ilvl="5" w:tplc="08090005" w:tentative="1">
+      <w:start w:val="1"/>
+      <w:numFmt w:val="bullet"/>
+      <w:lvlText w:val=""/>
+      <w:lvlJc w:val="left"/>
+      <w:pPr>
+        <w:ind w:left="4320" w:hanging="360"/>
+      </w:pPr>
+      <w:rPr>
+        <w:rFonts w:ascii="Wingdings" w:hAnsi="Wingdings" w:hint="default"/>
+      </w:rPr>
+    </w:lvl>
+    <w:lvl w:ilvl="6" w:tplc="08090001" w:tentative="1">
+      <w:start w:val="1"/>
+      <w:numFmt w:val="bullet"/>
+      <w:lvlText w:val=""/>
+      <w:lvlJc w:val="left"/>
+      <w:pPr>
+        <w:ind w:left="5040" w:hanging="360"/>
+      </w:pPr>
+      <w:rPr>
+        <w:rFonts w:ascii="Symbol" w:hAnsi="Symbol" w:hint="default"/>
+      </w:rPr>
+    </w:lvl>
+    <w:lvl w:ilvl="7" w:tplc="08090003" w:tentative="1">
+      <w:start w:val="1"/>
+      <w:numFmt w:val="bullet"/>
+      <w:lvlText w:val="o"/>
+      <w:lvlJc w:val="left"/>
+      <w:pPr>
+        <w:ind w:left="5760" w:hanging="360"/>
+      </w:pPr>
+      <w:rPr>
+        <w:rFonts w:ascii="Courier New" w:hAnsi="Courier New" w:cs="Courier New" w:hint="default"/>
+      </w:rPr>
+    </w:lvl>
+    <w:lvl w:ilvl="8" w:tplc="08090005" w:tentative="1">
+      <w:start w:val="1"/>
+      <w:numFmt w:val="bullet"/>
+      <w:lvlText w:val=""/>
+      <w:lvlJc w:val="left"/>
+      <w:pPr>
+        <w:ind w:left="6480" w:hanging="360"/>
+      </w:pPr>
+      <w:rPr>
+        <w:rFonts w:ascii="Wingdings" w:hAnsi="Wingdings" w:hint="default"/>
+      </w:rPr>
+    </w:lvl>
+  </w:abstractNum>
+  <w:abstractNum w:abstractNumId="1" w15:restartNumberingAfterBreak="0">
     <w:nsid w:val="067204C1"/>
     <w:multiLevelType w:val="hybridMultilevel"/>
     <w:tmpl w:val="30D85838"/>
@@ -1863,7 +2060,7 @@
       </w:rPr>
     </w:lvl>
   </w:abstractNum>
-  <w:abstractNum w:abstractNumId="1" w15:restartNumberingAfterBreak="0">
+  <w:abstractNum w:abstractNumId="2" w15:restartNumberingAfterBreak="0">
     <w:nsid w:val="0EC55395"/>
     <w:multiLevelType w:val="hybridMultilevel"/>
     <w:tmpl w:val="A7BC43A6"/>
@@ -1976,7 +2173,7 @@
       </w:rPr>
     </w:lvl>
   </w:abstractNum>
-  <w:abstractNum w:abstractNumId="2" w15:restartNumberingAfterBreak="0">
+  <w:abstractNum w:abstractNumId="3" w15:restartNumberingAfterBreak="0">
     <w:nsid w:val="13974312"/>
     <w:multiLevelType w:val="hybridMultilevel"/>
     <w:tmpl w:val="B1C8F1D6"/>
@@ -2089,7 +2286,7 @@
       </w:rPr>
     </w:lvl>
   </w:abstractNum>
-  <w:abstractNum w:abstractNumId="3" w15:restartNumberingAfterBreak="0">
+  <w:abstractNum w:abstractNumId="4" w15:restartNumberingAfterBreak="0">
     <w:nsid w:val="27FA6282"/>
     <w:multiLevelType w:val="hybridMultilevel"/>
     <w:tmpl w:val="DB306AB4"/>
@@ -2202,7 +2399,7 @@
       </w:rPr>
     </w:lvl>
   </w:abstractNum>
-  <w:abstractNum w:abstractNumId="4" w15:restartNumberingAfterBreak="0">
+  <w:abstractNum w:abstractNumId="5" w15:restartNumberingAfterBreak="0">
     <w:nsid w:val="28D52344"/>
     <w:multiLevelType w:val="hybridMultilevel"/>
     <w:tmpl w:val="5A1C3718"/>
@@ -2288,7 +2485,7 @@
       </w:pPr>
     </w:lvl>
   </w:abstractNum>
-  <w:abstractNum w:abstractNumId="5" w15:restartNumberingAfterBreak="0">
+  <w:abstractNum w:abstractNumId="6" w15:restartNumberingAfterBreak="0">
     <w:nsid w:val="2BED7090"/>
     <w:multiLevelType w:val="hybridMultilevel"/>
     <w:tmpl w:val="23583C0C"/>
@@ -2374,7 +2571,7 @@
       </w:pPr>
     </w:lvl>
   </w:abstractNum>
-  <w:abstractNum w:abstractNumId="6" w15:restartNumberingAfterBreak="0">
+  <w:abstractNum w:abstractNumId="7" w15:restartNumberingAfterBreak="0">
     <w:nsid w:val="4BBC35E2"/>
     <w:multiLevelType w:val="hybridMultilevel"/>
     <w:tmpl w:val="9C5C0790"/>
@@ -2487,7 +2684,7 @@
       </w:rPr>
     </w:lvl>
   </w:abstractNum>
-  <w:abstractNum w:abstractNumId="7" w15:restartNumberingAfterBreak="0">
+  <w:abstractNum w:abstractNumId="8" w15:restartNumberingAfterBreak="0">
     <w:nsid w:val="53397B52"/>
     <w:multiLevelType w:val="hybridMultilevel"/>
     <w:tmpl w:val="2ADEE114"/>
@@ -2600,7 +2797,7 @@
       </w:rPr>
     </w:lvl>
   </w:abstractNum>
-  <w:abstractNum w:abstractNumId="8" w15:restartNumberingAfterBreak="0">
+  <w:abstractNum w:abstractNumId="9" w15:restartNumberingAfterBreak="0">
     <w:nsid w:val="55766A65"/>
     <w:multiLevelType w:val="hybridMultilevel"/>
     <w:tmpl w:val="0B0E51F6"/>
@@ -2713,7 +2910,7 @@
       </w:rPr>
     </w:lvl>
   </w:abstractNum>
-  <w:abstractNum w:abstractNumId="9" w15:restartNumberingAfterBreak="0">
+  <w:abstractNum w:abstractNumId="10" w15:restartNumberingAfterBreak="0">
     <w:nsid w:val="59B2472F"/>
     <w:multiLevelType w:val="hybridMultilevel"/>
     <w:tmpl w:val="3A9CBA58"/>
@@ -2826,7 +3023,7 @@
       </w:rPr>
     </w:lvl>
   </w:abstractNum>
-  <w:abstractNum w:abstractNumId="10" w15:restartNumberingAfterBreak="0">
+  <w:abstractNum w:abstractNumId="11" w15:restartNumberingAfterBreak="0">
     <w:nsid w:val="59D503DE"/>
     <w:multiLevelType w:val="hybridMultilevel"/>
     <w:tmpl w:val="12C8EA1C"/>
@@ -2939,7 +3136,7 @@
       </w:rPr>
     </w:lvl>
   </w:abstractNum>
-  <w:abstractNum w:abstractNumId="11" w15:restartNumberingAfterBreak="0">
+  <w:abstractNum w:abstractNumId="12" w15:restartNumberingAfterBreak="0">
     <w:nsid w:val="5AAF3CE0"/>
     <w:multiLevelType w:val="hybridMultilevel"/>
     <w:tmpl w:val="59C080FC"/>
@@ -3052,7 +3249,7 @@
       </w:rPr>
     </w:lvl>
   </w:abstractNum>
-  <w:abstractNum w:abstractNumId="12" w15:restartNumberingAfterBreak="0">
+  <w:abstractNum w:abstractNumId="13" w15:restartNumberingAfterBreak="0">
     <w:nsid w:val="627209BE"/>
     <w:multiLevelType w:val="hybridMultilevel"/>
     <w:tmpl w:val="D7AEBA42"/>
@@ -3165,7 +3362,7 @@
       </w:rPr>
     </w:lvl>
   </w:abstractNum>
-  <w:abstractNum w:abstractNumId="13" w15:restartNumberingAfterBreak="0">
+  <w:abstractNum w:abstractNumId="14" w15:restartNumberingAfterBreak="0">
     <w:nsid w:val="627C713C"/>
     <w:multiLevelType w:val="hybridMultilevel"/>
     <w:tmpl w:val="CEB2126E"/>
@@ -3278,7 +3475,7 @@
       </w:rPr>
     </w:lvl>
   </w:abstractNum>
-  <w:abstractNum w:abstractNumId="14" w15:restartNumberingAfterBreak="0">
+  <w:abstractNum w:abstractNumId="15" w15:restartNumberingAfterBreak="0">
     <w:nsid w:val="63464918"/>
     <w:multiLevelType w:val="hybridMultilevel"/>
     <w:tmpl w:val="AF06EAB6"/>
@@ -3391,7 +3588,7 @@
       </w:rPr>
     </w:lvl>
   </w:abstractNum>
-  <w:abstractNum w:abstractNumId="15" w15:restartNumberingAfterBreak="0">
+  <w:abstractNum w:abstractNumId="16" w15:restartNumberingAfterBreak="0">
     <w:nsid w:val="684D22C2"/>
     <w:multiLevelType w:val="hybridMultilevel"/>
     <w:tmpl w:val="509CCAF2"/>
@@ -3504,7 +3701,7 @@
       </w:rPr>
     </w:lvl>
   </w:abstractNum>
-  <w:abstractNum w:abstractNumId="16" w15:restartNumberingAfterBreak="0">
+  <w:abstractNum w:abstractNumId="17" w15:restartNumberingAfterBreak="0">
     <w:nsid w:val="6E6D1FAC"/>
     <w:multiLevelType w:val="hybridMultilevel"/>
     <w:tmpl w:val="9120E18C"/>
@@ -3617,7 +3814,7 @@
       </w:rPr>
     </w:lvl>
   </w:abstractNum>
-  <w:abstractNum w:abstractNumId="17" w15:restartNumberingAfterBreak="0">
+  <w:abstractNum w:abstractNumId="18" w15:restartNumberingAfterBreak="0">
     <w:nsid w:val="779B4CD6"/>
     <w:multiLevelType w:val="hybridMultilevel"/>
     <w:tmpl w:val="EFF09098"/>
@@ -3730,7 +3927,7 @@
       </w:rPr>
     </w:lvl>
   </w:abstractNum>
-  <w:abstractNum w:abstractNumId="18" w15:restartNumberingAfterBreak="0">
+  <w:abstractNum w:abstractNumId="19" w15:restartNumberingAfterBreak="0">
     <w:nsid w:val="7B391C8D"/>
     <w:multiLevelType w:val="hybridMultilevel"/>
     <w:tmpl w:val="BD3AEF2A"/>
@@ -3843,7 +4040,7 @@
       </w:rPr>
     </w:lvl>
   </w:abstractNum>
-  <w:abstractNum w:abstractNumId="19" w15:restartNumberingAfterBreak="0">
+  <w:abstractNum w:abstractNumId="20" w15:restartNumberingAfterBreak="0">
     <w:nsid w:val="7EA717D8"/>
     <w:multiLevelType w:val="hybridMultilevel"/>
     <w:tmpl w:val="21D40268"/>
@@ -3957,64 +4154,67 @@
     </w:lvl>
   </w:abstractNum>
   <w:num w:numId="1" w16cid:durableId="852378810">
+    <w:abstractNumId w:val="10"/>
+  </w:num>
+  <w:num w:numId="2" w16cid:durableId="591620193">
+    <w:abstractNumId w:val="12"/>
+  </w:num>
+  <w:num w:numId="3" w16cid:durableId="1909878718">
+    <w:abstractNumId w:val="20"/>
+  </w:num>
+  <w:num w:numId="4" w16cid:durableId="1664698677">
+    <w:abstractNumId w:val="6"/>
+  </w:num>
+  <w:num w:numId="5" w16cid:durableId="2076974679">
+    <w:abstractNumId w:val="4"/>
+  </w:num>
+  <w:num w:numId="6" w16cid:durableId="1018237135">
+    <w:abstractNumId w:val="2"/>
+  </w:num>
+  <w:num w:numId="7" w16cid:durableId="244000354">
+    <w:abstractNumId w:val="5"/>
+  </w:num>
+  <w:num w:numId="8" w16cid:durableId="42751345">
+    <w:abstractNumId w:val="1"/>
+  </w:num>
+  <w:num w:numId="9" w16cid:durableId="572738217">
+    <w:abstractNumId w:val="16"/>
+  </w:num>
+  <w:num w:numId="10" w16cid:durableId="1907835534">
+    <w:abstractNumId w:val="3"/>
+  </w:num>
+  <w:num w:numId="11" w16cid:durableId="952396051">
+    <w:abstractNumId w:val="11"/>
+  </w:num>
+  <w:num w:numId="12" w16cid:durableId="1977485924">
+    <w:abstractNumId w:val="7"/>
+  </w:num>
+  <w:num w:numId="13" w16cid:durableId="433668672">
     <w:abstractNumId w:val="9"/>
   </w:num>
-  <w:num w:numId="2" w16cid:durableId="591620193">
-    <w:abstractNumId w:val="11"/>
+  <w:num w:numId="14" w16cid:durableId="1475835214">
+    <w:abstractNumId w:val="18"/>
   </w:num>
-  <w:num w:numId="3" w16cid:durableId="1909878718">
+  <w:num w:numId="15" w16cid:durableId="1704287690">
+    <w:abstractNumId w:val="13"/>
+  </w:num>
+  <w:num w:numId="16" w16cid:durableId="2057506255">
     <w:abstractNumId w:val="19"/>
   </w:num>
-  <w:num w:numId="4" w16cid:durableId="1664698677">
-    <w:abstractNumId w:val="5"/>
-  </w:num>
-  <w:num w:numId="5" w16cid:durableId="2076974679">
-    <w:abstractNumId w:val="3"/>
-  </w:num>
-  <w:num w:numId="6" w16cid:durableId="1018237135">
-    <w:abstractNumId w:val="1"/>
-  </w:num>
-  <w:num w:numId="7" w16cid:durableId="244000354">
-    <w:abstractNumId w:val="4"/>
-  </w:num>
-  <w:num w:numId="8" w16cid:durableId="42751345">
-    <w:abstractNumId w:val="0"/>
-  </w:num>
-  <w:num w:numId="9" w16cid:durableId="572738217">
+  <w:num w:numId="17" w16cid:durableId="990404900">
     <w:abstractNumId w:val="15"/>
   </w:num>
-  <w:num w:numId="10" w16cid:durableId="1907835534">
-    <w:abstractNumId w:val="2"/>
-  </w:num>
-  <w:num w:numId="11" w16cid:durableId="952396051">
-    <w:abstractNumId w:val="10"/>
-  </w:num>
-  <w:num w:numId="12" w16cid:durableId="1977485924">
-    <w:abstractNumId w:val="6"/>
-  </w:num>
-  <w:num w:numId="13" w16cid:durableId="433668672">
+  <w:num w:numId="18" w16cid:durableId="1802728844">
     <w:abstractNumId w:val="8"/>
   </w:num>
-  <w:num w:numId="14" w16cid:durableId="1475835214">
+  <w:num w:numId="19" w16cid:durableId="1528567615">
     <w:abstractNumId w:val="17"/>
   </w:num>
-  <w:num w:numId="15" w16cid:durableId="1704287690">
-    <w:abstractNumId w:val="12"/>
-  </w:num>
-  <w:num w:numId="16" w16cid:durableId="2057506255">
-    <w:abstractNumId w:val="18"/>
-  </w:num>
-  <w:num w:numId="17" w16cid:durableId="990404900">
+  <w:num w:numId="20" w16cid:durableId="744105211">
     <w:abstractNumId w:val="14"/>
   </w:num>
-  <w:num w:numId="18" w16cid:durableId="1802728844">
-    <w:abstractNumId w:val="7"/>
-  </w:num>
-  <w:num w:numId="19" w16cid:durableId="1528567615">
-    <w:abstractNumId w:val="16"/>
-  </w:num>
-  <w:num w:numId="20" w16cid:durableId="744105211">
-    <w:abstractNumId w:val="13"/>
+  <w:num w:numId="21" w16cid:durableId="255595777">
+    <w:abstractNumId w:val="0"/>
   </w:num>
 </w:numbering>
 </file>

</xml_diff>